<commit_message>
feat: add docx template management and CR user form support in MasterDataWorkspace
</commit_message>
<xml_diff>
--- a/templates/cr_user/cr_user.docx
+++ b/templates/cr_user/cr_user.docx
@@ -244,8 +244,6 @@
               </w:rPr>
               <w:t>TRST</w:t>
             </w:r>
-            <w:bookmarkStart w:id="2" w:name="_GoBack"/>
-            <w:bookmarkEnd w:id="2"/>
           </w:p>
         </w:tc>
         <w:tc>
@@ -598,8 +596,8 @@
                 <w:lang w:val="en-US"/>
               </w:rPr>
             </w:pPr>
-            <w:bookmarkStart w:id="3" w:name="TMErsteller"/>
-            <w:bookmarkEnd w:id="3"/>
+            <w:bookmarkStart w:id="2" w:name="TMErsteller"/>
+            <w:bookmarkEnd w:id="2"/>
             <w:r>
               <w:rPr>
                 <w:rFonts w:cs="Arial"/>
@@ -778,7 +776,7 @@
           <w:szCs w:val="28"/>
         </w:rPr>
       </w:pPr>
-      <w:bookmarkStart w:id="4" w:name="_Toc238454179"/>
+      <w:bookmarkStart w:id="3" w:name="_Toc238454179"/>
     </w:p>
     <w:p>
       <w:pPr>
@@ -787,7 +785,7 @@
           <w:color w:val="002060"/>
         </w:rPr>
       </w:pPr>
-      <w:bookmarkStart w:id="5" w:name="_Toc259202264"/>
+      <w:bookmarkStart w:id="4" w:name="_Toc259202264"/>
       <w:r>
         <w:br w:type="page"/>
       </w:r>
@@ -798,8 +796,8 @@
         <w:lastRenderedPageBreak/>
         <w:t>Description of Requirements</w:t>
       </w:r>
+      <w:bookmarkEnd w:id="3"/>
       <w:bookmarkEnd w:id="4"/>
-      <w:bookmarkEnd w:id="5"/>
     </w:p>
     <w:p>
       <w:pPr>
@@ -1052,7 +1050,7 @@
       </w:tr>
     </w:tbl>
     <w:p>
-      <w:bookmarkStart w:id="6" w:name="_Toc238454181"/>
+      <w:bookmarkStart w:id="5" w:name="_Toc238454181"/>
     </w:p>
     <w:tbl>
       <w:tblPr>
@@ -1262,12 +1260,13 @@
           <w:p>
             <w:pPr>
               <w:jc w:val="center"/>
-              <w:rPr>
-                <w:rFonts w:cs="Arial"/>
-                <w:sz w:val="20"/>
-                <w:szCs w:val="20"/>
-              </w:rPr>
-            </w:pPr>
+            </w:pPr>
+            <w:r>
+              <w:rPr>
+                <w:highlight w:val="yellow"/>
+              </w:rPr>
+              <w:t>[DATE_DEV]</w:t>
+            </w:r>
           </w:p>
         </w:tc>
       </w:tr>
@@ -1350,12 +1349,13 @@
           <w:p>
             <w:pPr>
               <w:jc w:val="center"/>
-              <w:rPr>
-                <w:rFonts w:cs="Arial"/>
-                <w:sz w:val="20"/>
-                <w:szCs w:val="20"/>
-              </w:rPr>
-            </w:pPr>
+            </w:pPr>
+            <w:r>
+              <w:rPr>
+                <w:highlight w:val="yellow"/>
+              </w:rPr>
+              <w:t>[DATE_DEV]</w:t>
+            </w:r>
           </w:p>
         </w:tc>
       </w:tr>
@@ -1397,9 +1397,9 @@
           <w:color w:val="002060"/>
         </w:rPr>
       </w:pPr>
-      <w:bookmarkStart w:id="7" w:name="_Toc238454180"/>
-      <w:bookmarkStart w:id="8" w:name="_Toc259202265"/>
-      <w:bookmarkStart w:id="9" w:name="_Toc259202266"/>
+      <w:bookmarkStart w:id="6" w:name="_Toc238454180"/>
+      <w:bookmarkStart w:id="7" w:name="_Toc259202265"/>
+      <w:bookmarkStart w:id="8" w:name="_Toc259202266"/>
       <w:r>
         <w:rPr>
           <w:color w:val="002060"/>
@@ -1413,8 +1413,8 @@
         <w:lastRenderedPageBreak/>
         <w:t>Clearance for examination and assessment</w:t>
       </w:r>
+      <w:bookmarkEnd w:id="6"/>
       <w:bookmarkEnd w:id="7"/>
-      <w:bookmarkEnd w:id="8"/>
     </w:p>
     <w:p>
       <w:pPr>
@@ -1849,8 +1849,8 @@
         </w:rPr>
         <w:t>Examination and assessment of the change</w:t>
       </w:r>
-      <w:bookmarkEnd w:id="6"/>
-      <w:bookmarkEnd w:id="9"/>
+      <w:bookmarkEnd w:id="5"/>
+      <w:bookmarkEnd w:id="8"/>
     </w:p>
     <w:p>
       <w:pPr>
@@ -1987,7 +1987,7 @@
                 <w:highlight w:val="yellow"/>
                 <w:lang w:val="en-US"/>
               </w:rPr>
-              <w:t>[Date]</w:t>
+              <w:t>[DATE_QA]</w:t>
             </w:r>
           </w:p>
         </w:tc>
@@ -3022,7 +3022,7 @@
                 <w:highlight w:val="yellow"/>
                 <w:lang w:val="en-US"/>
               </w:rPr>
-              <w:t>[Date]</w:t>
+              <w:t>[DATE_QA]</w:t>
             </w:r>
           </w:p>
         </w:tc>
@@ -3273,7 +3273,7 @@
                 <w:szCs w:val="20"/>
               </w:rPr>
             </w:pPr>
-            <w:bookmarkStart w:id="10" w:name="_Toc238454182"/>
+            <w:bookmarkStart w:id="9" w:name="_Toc238454182"/>
             <w:r>
               <w:rPr>
                 <w:rFonts w:cs="Arial"/>
@@ -3438,12 +3438,14 @@
           <w:p>
             <w:pPr>
               <w:jc w:val="center"/>
-              <w:rPr>
-                <w:rFonts w:cs="Arial"/>
+            </w:pPr>
+            <w:r>
+              <w:rPr>
                 <w:sz w:val="20"/>
-                <w:szCs w:val="20"/>
-              </w:rPr>
-            </w:pPr>
+                <w:highlight w:val="yellow"/>
+              </w:rPr>
+              <w:t>[DATE_QA]</w:t>
+            </w:r>
           </w:p>
         </w:tc>
       </w:tr>
@@ -3528,13 +3530,14 @@
           <w:p>
             <w:pPr>
               <w:jc w:val="center"/>
-              <w:rPr>
-                <w:rFonts w:cs="Arial"/>
-                <w:b/>
+            </w:pPr>
+            <w:r>
+              <w:rPr>
                 <w:sz w:val="20"/>
-                <w:szCs w:val="20"/>
-              </w:rPr>
-            </w:pPr>
+                <w:highlight w:val="yellow"/>
+              </w:rPr>
+              <w:t>[DATE_QA]</w:t>
+            </w:r>
           </w:p>
         </w:tc>
       </w:tr>
@@ -3546,7 +3549,7 @@
           <w:color w:val="002060"/>
         </w:rPr>
       </w:pPr>
-      <w:bookmarkStart w:id="11" w:name="_Toc259202267"/>
+      <w:bookmarkStart w:id="10" w:name="_Toc259202267"/>
       <w:r>
         <w:br w:type="page"/>
       </w:r>
@@ -3557,8 +3560,8 @@
         <w:lastRenderedPageBreak/>
         <w:t>Decision</w:t>
       </w:r>
+      <w:bookmarkEnd w:id="9"/>
       <w:bookmarkEnd w:id="10"/>
-      <w:bookmarkEnd w:id="11"/>
     </w:p>
     <w:p>
       <w:pPr>
@@ -4033,13 +4036,18 @@
           </w:tcPr>
           <w:p>
             <w:pPr>
-              <w:rPr>
-                <w:rFonts w:cs="Arial"/>
-                <w:b/>
+              <w:jc w:val="center"/>
+              <w:rPr>
                 <w:sz w:val="20"/>
-                <w:szCs w:val="20"/>
-              </w:rPr>
-            </w:pPr>
+              </w:rPr>
+            </w:pPr>
+            <w:r>
+              <w:rPr>
+                <w:sz w:val="20"/>
+                <w:highlight w:val="yellow"/>
+              </w:rPr>
+              <w:t>[DATE_PRD]</w:t>
+            </w:r>
           </w:p>
         </w:tc>
       </w:tr>
@@ -4129,13 +4137,18 @@
           </w:tcPr>
           <w:p>
             <w:pPr>
-              <w:rPr>
-                <w:rFonts w:cs="Arial"/>
-                <w:b/>
+              <w:jc w:val="center"/>
+              <w:rPr>
                 <w:sz w:val="20"/>
-                <w:szCs w:val="20"/>
-              </w:rPr>
-            </w:pPr>
+              </w:rPr>
+            </w:pPr>
+            <w:r>
+              <w:rPr>
+                <w:sz w:val="20"/>
+                <w:highlight w:val="yellow"/>
+              </w:rPr>
+              <w:t>[DATE_PRD]</w:t>
+            </w:r>
           </w:p>
         </w:tc>
       </w:tr>
@@ -4324,14 +4337,15 @@
           </w:tcPr>
           <w:p>
             <w:pPr>
-              <w:rPr>
-                <w:rFonts w:cs="Arial"/>
-                <w:b/>
+              <w:jc w:val="center"/>
+            </w:pPr>
+            <w:r>
+              <w:rPr>
                 <w:sz w:val="20"/>
-                <w:szCs w:val="20"/>
-                <w:u w:val="single"/>
-              </w:rPr>
-            </w:pPr>
+                <w:highlight w:val="yellow"/>
+              </w:rPr>
+              <w:t>[DATE_PRD]</w:t>
+            </w:r>
           </w:p>
         </w:tc>
       </w:tr>
@@ -4353,6 +4367,8 @@
           <w:lang w:val="en-US" w:eastAsia="x-none"/>
         </w:rPr>
       </w:pPr>
+      <w:bookmarkStart w:id="11" w:name="_GoBack"/>
+      <w:bookmarkEnd w:id="11"/>
     </w:p>
     <w:sectPr>
       <w:headerReference w:type="default" r:id="rId8"/>
@@ -4460,7 +4476,7 @@
         <w:sz w:val="16"/>
         <w:lang w:val="en-US"/>
       </w:rPr>
-      <w:t>1</w:t>
+      <w:t>5</w:t>
     </w:r>
     <w:r>
       <w:rPr>
@@ -11877,7 +11893,7 @@
 </file>
 
 <file path=customXml/itemProps1.xml><?xml version="1.0" encoding="utf-8"?>
-<ds:datastoreItem xmlns:ds="http://schemas.openxmlformats.org/officeDocument/2006/customXml" ds:itemID="{07C505D6-EE78-4174-A86B-D5A5ED9C25FA}">
+<ds:datastoreItem xmlns:ds="http://schemas.openxmlformats.org/officeDocument/2006/customXml" ds:itemID="{404BF046-1D0A-4510-B6A1-91E68E550550}">
   <ds:schemaRefs>
     <ds:schemaRef ds:uri="http://schemas.openxmlformats.org/officeDocument/2006/bibliography"/>
   </ds:schemaRefs>

</xml_diff>